<commit_message>
docs: finalize project submission package
</commit_message>
<xml_diff>
--- a/docs/Project-Specification.docx
+++ b/docs/Project-Specification.docx
@@ -49,16 +49,7 @@
       </w:tblGrid>
       <w:tr>
         <w:tc>
-          <w:tcPr>
-            <w:tcW w:type="dxa" w:w="3240"/>
-            <w:shd w:fill="EAF3F8"/>
-            <w:tcMar>
-              <w:top w:w="100" w:type="dxa"/>
-              <w:start w:w="120" w:type="dxa"/>
-              <w:bottom w:w="100" w:type="dxa"/>
-              <w:end w:w="120" w:type="dxa"/>
-            </w:tcMar>
-          </w:tcPr>
+          <w:tcPr/>
           <w:p>
             <w:r>
               <w:rPr>
@@ -69,15 +60,7 @@
           </w:p>
         </w:tc>
         <w:tc>
-          <w:tcPr>
-            <w:tcW w:type="dxa" w:w="6192"/>
-            <w:tcMar>
-              <w:top w:w="100" w:type="dxa"/>
-              <w:start w:w="120" w:type="dxa"/>
-              <w:bottom w:w="100" w:type="dxa"/>
-              <w:end w:w="120" w:type="dxa"/>
-            </w:tcMar>
-          </w:tcPr>
+          <w:tcPr/>
           <w:p>
             <w:r>
               <w:t>Argentina and Uruguay</w:t>
@@ -87,16 +70,7 @@
       </w:tr>
       <w:tr>
         <w:tc>
-          <w:tcPr>
-            <w:tcW w:type="dxa" w:w="3240"/>
-            <w:shd w:fill="EAF3F8"/>
-            <w:tcMar>
-              <w:top w:w="100" w:type="dxa"/>
-              <w:start w:w="120" w:type="dxa"/>
-              <w:bottom w:w="100" w:type="dxa"/>
-              <w:end w:w="120" w:type="dxa"/>
-            </w:tcMar>
-          </w:tcPr>
+          <w:tcPr/>
           <w:p>
             <w:r>
               <w:rPr>
@@ -107,15 +81,7 @@
           </w:p>
         </w:tc>
         <w:tc>
-          <w:tcPr>
-            <w:tcW w:type="dxa" w:w="6192"/>
-            <w:tcMar>
-              <w:top w:w="100" w:type="dxa"/>
-              <w:start w:w="120" w:type="dxa"/>
-              <w:bottom w:w="100" w:type="dxa"/>
-              <w:end w:w="120" w:type="dxa"/>
-            </w:tcMar>
-          </w:tcPr>
+          <w:tcPr/>
           <w:p>
             <w:r>
               <w:t>HIT Project Center</w:t>
@@ -125,16 +91,70 @@
       </w:tr>
       <w:tr>
         <w:tc>
-          <w:tcPr>
-            <w:tcW w:type="dxa" w:w="3240"/>
-            <w:shd w:fill="EAF3F8"/>
-            <w:tcMar>
-              <w:top w:w="100" w:type="dxa"/>
-              <w:start w:w="120" w:type="dxa"/>
-              <w:bottom w:w="100" w:type="dxa"/>
-              <w:end w:w="120" w:type="dxa"/>
-            </w:tcMar>
-          </w:tcPr>
+          <w:tcPr/>
+          <w:p>
+            <w:r>
+              <w:rPr>
+                <w:b/>
+              </w:rPr>
+              <w:t>Prepared by</w:t>
+            </w:r>
+          </w:p>
+        </w:tc>
+        <w:tc>
+          <w:tcPr/>
+          <w:p>
+            <w:r>
+              <w:t>Daniel Lankry</w:t>
+            </w:r>
+          </w:p>
+        </w:tc>
+      </w:tr>
+      <w:tr>
+        <w:tc>
+          <w:tcPr/>
+          <w:p>
+            <w:r>
+              <w:rPr>
+                <w:b/>
+              </w:rPr>
+              <w:t>Contact</w:t>
+            </w:r>
+          </w:p>
+        </w:tc>
+        <w:tc>
+          <w:tcPr/>
+          <w:p>
+            <w:r>
+              <w:t>lankrydaniel7@gmail.com</w:t>
+            </w:r>
+          </w:p>
+        </w:tc>
+      </w:tr>
+      <w:tr>
+        <w:tc>
+          <w:tcPr/>
+          <w:p>
+            <w:r>
+              <w:rPr>
+                <w:b/>
+              </w:rPr>
+              <w:t>Repository</w:t>
+            </w:r>
+          </w:p>
+        </w:tc>
+        <w:tc>
+          <w:tcPr/>
+          <w:p>
+            <w:r>
+              <w:t>github.com/DanielLankry/Project-HIT---Real-Estate</w:t>
+            </w:r>
+          </w:p>
+        </w:tc>
+      </w:tr>
+      <w:tr>
+        <w:tc>
+          <w:tcPr/>
           <w:p>
             <w:r>
               <w:rPr>
@@ -145,34 +165,17 @@
           </w:p>
         </w:tc>
         <w:tc>
-          <w:tcPr>
-            <w:tcW w:type="dxa" w:w="6192"/>
-            <w:tcMar>
-              <w:top w:w="100" w:type="dxa"/>
-              <w:start w:w="120" w:type="dxa"/>
-              <w:bottom w:w="100" w:type="dxa"/>
-              <w:end w:w="120" w:type="dxa"/>
-            </w:tcMar>
-          </w:tcPr>
+          <w:tcPr/>
           <w:p>
             <w:r>
-              <w:t>17 August 2026</w:t>
+              <w:t>3 September 2026</w:t>
             </w:r>
           </w:p>
         </w:tc>
       </w:tr>
       <w:tr>
         <w:tc>
-          <w:tcPr>
-            <w:tcW w:type="dxa" w:w="3240"/>
-            <w:shd w:fill="EAF3F8"/>
-            <w:tcMar>
-              <w:top w:w="100" w:type="dxa"/>
-              <w:start w:w="120" w:type="dxa"/>
-              <w:bottom w:w="100" w:type="dxa"/>
-              <w:end w:w="120" w:type="dxa"/>
-            </w:tcMar>
-          </w:tcPr>
+          <w:tcPr/>
           <w:p>
             <w:r>
               <w:rPr>
@@ -183,18 +186,10 @@
           </w:p>
         </w:tc>
         <w:tc>
-          <w:tcPr>
-            <w:tcW w:type="dxa" w:w="6192"/>
-            <w:tcMar>
-              <w:top w:w="100" w:type="dxa"/>
-              <w:start w:w="120" w:type="dxa"/>
-              <w:bottom w:w="100" w:type="dxa"/>
-              <w:end w:w="120" w:type="dxa"/>
-            </w:tcMar>
-          </w:tcPr>
+          <w:tcPr/>
           <w:p>
             <w:r>
-              <w:t>Core project deliverables complete; future trend forecasting remains future work</w:t>
+              <w:t>Core project and local submission files complete; future-trend forecasting remains a documented extension</w:t>
             </w:r>
           </w:p>
         </w:tc>
@@ -230,11 +225,10 @@
                 <w:sz w:val="26"/>
               </w:rPr>
               <w:t>Summary</w:t>
+              <w:br/>
+              <w:t>The project has a working scraper, two cleaned datasets, a simple EDA notebook, a validated Ridge Regression baseline, World Bank economic context, a terminal predictor, this specification, a final presentation, and a recorded walkthrough. The current model estimates online asking prices. It does not claim to predict future market prices because historical listing snapshots are not yet available.</w:t>
             </w:r>
-            <w:r>
-              <w:br/>
-              <w:t>The project has a working scraper, two cleaned datasets, a simple EDA notebook, a validated Ridge Regression baseline, World Bank economic context, this specification, and a final presentation. The current model estimates online asking prices. It does not claim to predict future market prices because historical listing snapshots are not yet available.</w:t>
-            </w:r>
+            <w:r/>
           </w:p>
         </w:tc>
       </w:tr>
@@ -274,6 +268,12 @@
     <w:p>
       <w:r>
         <w:t>The project studies residential real-estate listings in Argentina and Uruguay. It collects public listing information, organizes it into reusable datasets, explores price relationships, and builds a basic model for estimating listing prices in US dollars.</w:t>
+      </w:r>
+    </w:p>
+    <w:p>
+      <w:pPr/>
+      <w:r>
+        <w:t>Implemented scope: the available sources provide a cross-sectional set of sale listings. The finished baseline estimates current asking prices; genuine future-trend forecasting remains a documented extension that requires dated listing snapshots.</w:t>
       </w:r>
     </w:p>
     <w:p>
@@ -494,7 +494,7 @@
           </w:tcPr>
           <w:p>
             <w:r>
-              <w:t>Scraping scripts</w:t>
+              <w:t>GitHub repository</w:t>
             </w:r>
           </w:p>
         </w:tc>
@@ -532,7 +532,7 @@
           </w:tcPr>
           <w:p>
             <w:r>
-              <w:t>code/scrape_real_estate_training_data.py</w:t>
+              <w:t>github.com/DanielLankry/Project-HIT---Real-Estate</w:t>
             </w:r>
           </w:p>
         </w:tc>
@@ -552,241 +552,7 @@
           </w:tcPr>
           <w:p>
             <w:r>
-              <w:t>Datasets</w:t>
-            </w:r>
-          </w:p>
-        </w:tc>
-        <w:tc>
-          <w:tcPr>
-            <w:tcW w:type="dxa" w:w="1800"/>
-            <w:vAlign w:val="center"/>
-            <w:tcMar>
-              <w:top w:w="100" w:type="dxa"/>
-              <w:start w:w="120" w:type="dxa"/>
-              <w:bottom w:w="100" w:type="dxa"/>
-              <w:end w:w="120" w:type="dxa"/>
-            </w:tcMar>
-            <w:shd w:fill="F2F2F2"/>
-          </w:tcPr>
-          <w:p>
-            <w:r>
-              <w:rPr>
-                <w:b/>
-                <w:color w:val="166534"/>
-              </w:rPr>
-              <w:t>Complete</w:t>
-            </w:r>
-          </w:p>
-        </w:tc>
-        <w:tc>
-          <w:tcPr>
-            <w:tcW w:type="dxa" w:w="4536"/>
-            <w:vAlign w:val="center"/>
-            <w:tcMar>
-              <w:top w:w="100" w:type="dxa"/>
-              <w:start w:w="120" w:type="dxa"/>
-              <w:bottom w:w="100" w:type="dxa"/>
-              <w:end w:w="120" w:type="dxa"/>
-            </w:tcMar>
-            <w:shd w:fill="F2F2F2"/>
-          </w:tcPr>
-          <w:p>
-            <w:r>
-              <w:t>data/scraped_real_estate_*.csv</w:t>
-            </w:r>
-          </w:p>
-        </w:tc>
-      </w:tr>
-      <w:tr>
-        <w:tc>
-          <w:tcPr>
-            <w:tcW w:type="dxa" w:w="3096"/>
-            <w:vAlign w:val="center"/>
-            <w:tcMar>
-              <w:top w:w="100" w:type="dxa"/>
-              <w:start w:w="120" w:type="dxa"/>
-              <w:bottom w:w="100" w:type="dxa"/>
-              <w:end w:w="120" w:type="dxa"/>
-            </w:tcMar>
-          </w:tcPr>
-          <w:p>
-            <w:r>
-              <w:t>EDA notebook</w:t>
-            </w:r>
-          </w:p>
-        </w:tc>
-        <w:tc>
-          <w:tcPr>
-            <w:tcW w:type="dxa" w:w="1800"/>
-            <w:vAlign w:val="center"/>
-            <w:tcMar>
-              <w:top w:w="100" w:type="dxa"/>
-              <w:start w:w="120" w:type="dxa"/>
-              <w:bottom w:w="100" w:type="dxa"/>
-              <w:end w:w="120" w:type="dxa"/>
-            </w:tcMar>
-          </w:tcPr>
-          <w:p>
-            <w:r>
-              <w:rPr>
-                <w:b/>
-                <w:color w:val="166534"/>
-              </w:rPr>
-              <w:t>Complete</w:t>
-            </w:r>
-          </w:p>
-        </w:tc>
-        <w:tc>
-          <w:tcPr>
-            <w:tcW w:type="dxa" w:w="4536"/>
-            <w:vAlign w:val="center"/>
-            <w:tcMar>
-              <w:top w:w="100" w:type="dxa"/>
-              <w:start w:w="120" w:type="dxa"/>
-              <w:bottom w:w="100" w:type="dxa"/>
-              <w:end w:w="120" w:type="dxa"/>
-            </w:tcMar>
-          </w:tcPr>
-          <w:p>
-            <w:r>
-              <w:t>code/eda_real_estate.ipynb</w:t>
-            </w:r>
-          </w:p>
-        </w:tc>
-      </w:tr>
-      <w:tr>
-        <w:tc>
-          <w:tcPr>
-            <w:tcW w:type="dxa" w:w="3096"/>
-            <w:vAlign w:val="center"/>
-            <w:tcMar>
-              <w:top w:w="100" w:type="dxa"/>
-              <w:start w:w="120" w:type="dxa"/>
-              <w:bottom w:w="100" w:type="dxa"/>
-              <w:end w:w="120" w:type="dxa"/>
-            </w:tcMar>
-            <w:shd w:fill="F2F2F2"/>
-          </w:tcPr>
-          <w:p>
-            <w:r>
-              <w:t>Price model</w:t>
-            </w:r>
-          </w:p>
-        </w:tc>
-        <w:tc>
-          <w:tcPr>
-            <w:tcW w:type="dxa" w:w="1800"/>
-            <w:vAlign w:val="center"/>
-            <w:tcMar>
-              <w:top w:w="100" w:type="dxa"/>
-              <w:start w:w="120" w:type="dxa"/>
-              <w:bottom w:w="100" w:type="dxa"/>
-              <w:end w:w="120" w:type="dxa"/>
-            </w:tcMar>
-            <w:shd w:fill="F2F2F2"/>
-          </w:tcPr>
-          <w:p>
-            <w:r>
-              <w:rPr>
-                <w:b/>
-                <w:color w:val="166534"/>
-              </w:rPr>
-              <w:t>Complete</w:t>
-            </w:r>
-          </w:p>
-        </w:tc>
-        <w:tc>
-          <w:tcPr>
-            <w:tcW w:type="dxa" w:w="4536"/>
-            <w:vAlign w:val="center"/>
-            <w:tcMar>
-              <w:top w:w="100" w:type="dxa"/>
-              <w:start w:w="120" w:type="dxa"/>
-              <w:bottom w:w="100" w:type="dxa"/>
-              <w:end w:w="120" w:type="dxa"/>
-            </w:tcMar>
-            <w:shd w:fill="F2F2F2"/>
-          </w:tcPr>
-          <w:p>
-            <w:r>
-              <w:t>code/real_estate_model.ipynb</w:t>
-            </w:r>
-          </w:p>
-        </w:tc>
-      </w:tr>
-      <w:tr>
-        <w:tc>
-          <w:tcPr>
-            <w:tcW w:type="dxa" w:w="3096"/>
-            <w:vAlign w:val="center"/>
-            <w:tcMar>
-              <w:top w:w="100" w:type="dxa"/>
-              <w:start w:w="120" w:type="dxa"/>
-              <w:bottom w:w="100" w:type="dxa"/>
-              <w:end w:w="120" w:type="dxa"/>
-            </w:tcMar>
-          </w:tcPr>
-          <w:p>
-            <w:r>
-              <w:t>Economic context</w:t>
-            </w:r>
-          </w:p>
-        </w:tc>
-        <w:tc>
-          <w:tcPr>
-            <w:tcW w:type="dxa" w:w="1800"/>
-            <w:vAlign w:val="center"/>
-            <w:tcMar>
-              <w:top w:w="100" w:type="dxa"/>
-              <w:start w:w="120" w:type="dxa"/>
-              <w:bottom w:w="100" w:type="dxa"/>
-              <w:end w:w="120" w:type="dxa"/>
-            </w:tcMar>
-          </w:tcPr>
-          <w:p>
-            <w:r>
-              <w:rPr>
-                <w:b/>
-                <w:color w:val="166534"/>
-              </w:rPr>
-              <w:t>Complete</w:t>
-            </w:r>
-          </w:p>
-        </w:tc>
-        <w:tc>
-          <w:tcPr>
-            <w:tcW w:type="dxa" w:w="4536"/>
-            <w:vAlign w:val="center"/>
-            <w:tcMar>
-              <w:top w:w="100" w:type="dxa"/>
-              <w:start w:w="120" w:type="dxa"/>
-              <w:bottom w:w="100" w:type="dxa"/>
-              <w:end w:w="120" w:type="dxa"/>
-            </w:tcMar>
-          </w:tcPr>
-          <w:p>
-            <w:r>
-              <w:t>data/macroeconomic_indicators.csv</w:t>
-            </w:r>
-          </w:p>
-        </w:tc>
-      </w:tr>
-      <w:tr>
-        <w:tc>
-          <w:tcPr>
-            <w:tcW w:type="dxa" w:w="3096"/>
-            <w:vAlign w:val="center"/>
-            <w:tcMar>
-              <w:top w:w="100" w:type="dxa"/>
-              <w:start w:w="120" w:type="dxa"/>
-              <w:bottom w:w="100" w:type="dxa"/>
-              <w:end w:w="120" w:type="dxa"/>
-            </w:tcMar>
-            <w:shd w:fill="F2F2F2"/>
-          </w:tcPr>
-          <w:p>
-            <w:r>
-              <w:t>Presentation</w:t>
+              <w:t>Final presentation</w:t>
             </w:r>
           </w:p>
         </w:tc>
@@ -845,7 +611,7 @@
           </w:tcPr>
           <w:p>
             <w:r>
-              <w:t>Future trend forecast</w:t>
+              <w:t>Recorded walkthrough</w:t>
             </w:r>
           </w:p>
         </w:tc>
@@ -864,9 +630,9 @@
             <w:r>
               <w:rPr>
                 <w:b/>
-                <w:color w:val="92400E"/>
+                <w:color w:val="166534"/>
               </w:rPr>
-              <w:t>Future work</w:t>
+              <w:t>Supplementary</w:t>
             </w:r>
           </w:p>
         </w:tc>
@@ -880,6 +646,66 @@
               <w:bottom w:w="100" w:type="dxa"/>
               <w:end w:w="120" w:type="dxa"/>
             </w:tcMar>
+          </w:tcPr>
+          <w:p>
+            <w:r>
+              <w:t>Explaining Video.mov</w:t>
+            </w:r>
+          </w:p>
+        </w:tc>
+      </w:tr>
+      <w:tr>
+        <w:tc>
+          <w:tcPr>
+            <w:tcW w:type="dxa" w:w="3096"/>
+            <w:vAlign w:val="center"/>
+            <w:tcMar>
+              <w:top w:w="100" w:type="dxa"/>
+              <w:start w:w="120" w:type="dxa"/>
+              <w:bottom w:w="100" w:type="dxa"/>
+              <w:end w:w="120" w:type="dxa"/>
+            </w:tcMar>
+            <w:shd w:fill="F2F2F2"/>
+          </w:tcPr>
+          <w:p>
+            <w:r>
+              <w:t>Future trend forecasting</w:t>
+            </w:r>
+          </w:p>
+        </w:tc>
+        <w:tc>
+          <w:tcPr>
+            <w:tcW w:type="dxa" w:w="1800"/>
+            <w:vAlign w:val="center"/>
+            <w:tcMar>
+              <w:top w:w="100" w:type="dxa"/>
+              <w:start w:w="120" w:type="dxa"/>
+              <w:bottom w:w="100" w:type="dxa"/>
+              <w:end w:w="120" w:type="dxa"/>
+            </w:tcMar>
+            <w:shd w:fill="F2F2F2"/>
+          </w:tcPr>
+          <w:p>
+            <w:r>
+              <w:rPr>
+                <w:b/>
+                <w:color w:val="166534"/>
+              </w:rPr>
+              <w:t>Research extension</w:t>
+            </w:r>
+          </w:p>
+        </w:tc>
+        <w:tc>
+          <w:tcPr>
+            <w:tcW w:type="dxa" w:w="4536"/>
+            <w:vAlign w:val="center"/>
+            <w:tcMar>
+              <w:top w:w="100" w:type="dxa"/>
+              <w:start w:w="120" w:type="dxa"/>
+              <w:bottom w:w="100" w:type="dxa"/>
+              <w:end w:w="120" w:type="dxa"/>
+            </w:tcMar>
+            <w:shd w:fill="F2F2F2"/>
           </w:tcPr>
           <w:p>
             <w:r>
@@ -923,7 +749,7 @@
     </w:p>
     <w:p>
       <w:r>
-        <w:t>The approved real-estate sources are InfoCasas, ZonaProp, ArgenProp, and Gallito. The current full dataset contains 1,185 InfoCasas rows, 481 ZonaProp rows, and 6 ArgenProp rows. Gallito returns a Cloudflare challenge to normal requests, so it currently contributes no rows.</w:t>
+        <w:t>The approved real-estate sources are InfoCasas, ZonaProp, ArgenProp, and Gallito. The current full dataset contains 1,185 InfoCasas rows, 581 ZonaProp rows, and 11 ArgenProp rows. Gallito returns a Cloudflare challenge to normal requests, so it currently contributes no rows.</w:t>
       </w:r>
     </w:p>
     <w:p>
@@ -988,7 +814,7 @@
           </w:tcPr>
           <w:p>
             <w:r>
-              <w:t>1,672 rows × 161 columns. Detailed cleaned extraction used for source checks and debugging.</w:t>
+              <w:t>1,777 rows × 161 columns. Detailed cleaned extraction used for source checks and debugging.</w:t>
             </w:r>
           </w:p>
         </w:tc>
@@ -1026,7 +852,7 @@
           </w:tcPr>
           <w:p>
             <w:r>
-              <w:t>1,589 rows × 63 columns. Compact residential data used by EDA and modeling.</w:t>
+              <w:t>1,689 rows × 63 columns. Compact residential data used by EDA and modeling.</w:t>
             </w:r>
           </w:p>
         </w:tc>
@@ -1145,7 +971,7 @@
         <w:pStyle w:val="ListBullet"/>
       </w:pPr>
       <w:r>
-        <w:t>output — generated reports or notebook exports.</w:t>
+        <w:t>Generated notebook exports and temporary outputs are intentionally excluded from the active repository.</w:t>
       </w:r>
     </w:p>
     <w:p>
@@ -1420,7 +1246,7 @@
           </w:tcPr>
           <w:p>
             <w:r>
-              <w:t>Ridge Regression</w:t>
+              <w:t>Ridge Regression (alpha 10)</w:t>
             </w:r>
           </w:p>
         </w:tc>
@@ -1458,7 +1284,7 @@
           </w:tcPr>
           <w:p>
             <w:r>
-              <w:t>Approximately 0.636</w:t>
+              <w:t>0.628</w:t>
             </w:r>
           </w:p>
         </w:tc>
@@ -1496,7 +1322,7 @@
           </w:tcPr>
           <w:p>
             <w:r>
-              <w:t>0.623</w:t>
+              <w:t>0.475</w:t>
             </w:r>
           </w:p>
         </w:tc>
@@ -1534,7 +1360,45 @@
           </w:tcPr>
           <w:p>
             <w:r>
-              <w:t>$93,161</w:t>
+              <w:t>$105,473</w:t>
+            </w:r>
+          </w:p>
+        </w:tc>
+      </w:tr>
+      <w:tr>
+        <w:tc>
+          <w:tcPr>
+            <w:tcW w:type="dxa" w:w="3240"/>
+            <w:shd w:fill="EAF3F8"/>
+            <w:tcMar>
+              <w:top w:w="100" w:type="dxa"/>
+              <w:start w:w="120" w:type="dxa"/>
+              <w:bottom w:w="100" w:type="dxa"/>
+              <w:end w:w="120" w:type="dxa"/>
+            </w:tcMar>
+          </w:tcPr>
+          <w:p>
+            <w:r>
+              <w:rPr>
+                <w:b/>
+              </w:rPr>
+              <w:t>Held-out RMSE</w:t>
+            </w:r>
+          </w:p>
+        </w:tc>
+        <w:tc>
+          <w:tcPr>
+            <w:tcW w:type="dxa" w:w="6192"/>
+            <w:tcMar>
+              <w:top w:w="100" w:type="dxa"/>
+              <w:start w:w="120" w:type="dxa"/>
+              <w:bottom w:w="100" w:type="dxa"/>
+              <w:end w:w="120" w:type="dxa"/>
+            </w:tcMar>
+          </w:tcPr>
+          <w:p>
+            <w:r>
+              <w:t>$307,037</w:t>
             </w:r>
           </w:p>
         </w:tc>
@@ -1572,7 +1436,7 @@
           </w:tcPr>
           <w:p>
             <w:r>
-              <w:t>26.2%</w:t>
+              <w:t>27.2%</w:t>
             </w:r>
           </w:p>
         </w:tc>
@@ -1700,6 +1564,34 @@
     </w:p>
     <w:p>
       <w:pPr>
+        <w:ind w:left="360"/>
+      </w:pPr>
+      <w:r>
+        <w:rPr>
+          <w:b/>
+        </w:rPr>
+        <w:t>6.</w:t>
+      </w:r>
+      <w:r>
+        <w:t xml:space="preserve"> Run the terminal predictor: python code/predict_property.py</w:t>
+      </w:r>
+    </w:p>
+    <w:p>
+      <w:pPr>
+        <w:ind w:left="360"/>
+      </w:pPr>
+      <w:r>
+        <w:rPr>
+          <w:b/>
+        </w:rPr>
+        <w:t>7.</w:t>
+      </w:r>
+      <w:r>
+        <w:t xml:space="preserve"> Submit the repository link, docs/Project-Specification.docx, docs/Final-Project-Presentation.pptx, and the recorded walkthrough.</w:t>
+      </w:r>
+    </w:p>
+    <w:p>
+      <w:pPr>
         <w:pStyle w:val="Heading2"/>
       </w:pPr>
       <w:r>
@@ -1813,6 +1705,14 @@
       </w:pPr>
       <w:r>
         <w:t>World Bank GDP-growth indicator: https://data.worldbank.org/indicator/NY.GDP.MKTP.KD.ZG</w:t>
+      </w:r>
+    </w:p>
+    <w:p>
+      <w:pPr>
+        <w:pStyle w:val="ListBullet"/>
+      </w:pPr>
+      <w:r>
+        <w:t>Project repository: https://github.com/DanielLankry/Project-HIT---Real-Estate</w:t>
       </w:r>
     </w:p>
     <w:sectPr>

</xml_diff>